<commit_message>
changes to the resume
</commit_message>
<xml_diff>
--- a/public/files/resume.docx
+++ b/public/files/resume.docx
@@ -462,7 +462,7 @@
     </w:p>
     <w:p>
       <w:pPr>
-        <w:spacing w:after="85" w:line="215" w:lineRule="auto" w:before="0"/>
+        <w:spacing w:after="85" w:line="215" w:lineRule="auto"/>
         <w:ind w:left="360" w:hanging="180"/>
         <w:rPr>
           <w:sz w:val="28"/>
@@ -504,7 +504,7 @@
         <w:tabs>
           <w:tab w:val="right" w:pos="9360"/>
         </w:tabs>
-        <w:spacing w:line="220" w:lineRule="auto" w:before="110" w:after="0"/>
+        <w:spacing w:before="110" w:line="220" w:lineRule="auto"/>
         <w:rPr>
           <w:sz w:val="28"/>
           <w:szCs w:val="28"/>
@@ -622,7 +622,7 @@
     </w:p>
     <w:p>
       <w:pPr>
-        <w:spacing w:after="85" w:line="215" w:lineRule="auto" w:before="0"/>
+        <w:spacing w:after="85" w:line="215" w:lineRule="auto"/>
         <w:ind w:left="360" w:hanging="180"/>
         <w:rPr>
           <w:sz w:val="28"/>
@@ -664,7 +664,7 @@
         <w:tabs>
           <w:tab w:val="right" w:pos="9360"/>
         </w:tabs>
-        <w:spacing w:line="220" w:lineRule="auto" w:before="110" w:after="0"/>
+        <w:spacing w:before="110" w:line="220" w:lineRule="auto"/>
         <w:rPr>
           <w:sz w:val="28"/>
           <w:szCs w:val="28"/>
@@ -782,7 +782,7 @@
     </w:p>
     <w:p>
       <w:pPr>
-        <w:spacing w:after="85" w:line="215" w:lineRule="auto" w:before="0"/>
+        <w:spacing w:after="85" w:line="215" w:lineRule="auto"/>
         <w:ind w:left="360" w:hanging="180"/>
         <w:rPr>
           <w:sz w:val="28"/>
@@ -846,7 +846,7 @@
         <w:tabs>
           <w:tab w:val="right" w:pos="9360"/>
         </w:tabs>
-        <w:spacing w:line="220" w:lineRule="auto" w:before="20" w:after="0"/>
+        <w:spacing w:before="20" w:line="220" w:lineRule="auto"/>
         <w:rPr>
           <w:sz w:val="28"/>
           <w:szCs w:val="28"/>
@@ -964,7 +964,7 @@
     </w:p>
     <w:p>
       <w:pPr>
-        <w:spacing w:after="95" w:line="215" w:lineRule="auto" w:before="0"/>
+        <w:spacing w:after="95" w:line="215" w:lineRule="auto"/>
         <w:ind w:left="360" w:hanging="180"/>
         <w:rPr>
           <w:sz w:val="28"/>
@@ -1009,7 +1009,7 @@
         <w:tabs>
           <w:tab w:val="right" w:pos="9360"/>
         </w:tabs>
-        <w:spacing w:line="220" w:lineRule="auto" w:before="20" w:after="0"/>
+        <w:spacing w:before="20" w:line="220" w:lineRule="auto"/>
         <w:rPr>
           <w:sz w:val="28"/>
           <w:szCs w:val="28"/>
@@ -1038,11 +1038,32 @@
         <w:rPr>
           <w:rFonts w:ascii="Arial" w:hAnsi="Arial" w:cs="Arial"/>
           <w:b/>
-          <w:color w:val="000000"/>
-          <w:sz w:val="22"/>
-          <w:szCs w:val="28"/>
-        </w:rPr>
-        <w:t>April</w:t>
+          <w:bCs/>
+          <w:color w:val="000000"/>
+          <w:sz w:val="22"/>
+          <w:szCs w:val="28"/>
+        </w:rPr>
+        <w:t xml:space="preserve">Sep. 2023 – </w:t>
+      </w:r>
+      <w:r>
+        <w:rPr>
+          <w:rFonts w:ascii="Arial" w:hAnsi="Arial" w:cs="Arial"/>
+          <w:b/>
+          <w:color w:val="000000"/>
+          <w:sz w:val="22"/>
+          <w:szCs w:val="28"/>
+        </w:rPr>
+        <w:t>Apr</w:t>
+      </w:r>
+      <w:r>
+        <w:rPr>
+          <w:rFonts w:ascii="Arial" w:hAnsi="Arial" w:cs="Arial"/>
+          <w:b/>
+          <w:color w:val="000000"/>
+          <w:sz w:val="22"/>
+          <w:szCs w:val="28"/>
+        </w:rPr>
+        <w:t>.</w:t>
       </w:r>
       <w:r>
         <w:rPr>

</xml_diff>